<commit_message>
feat: implement Student Course Management System with file I/O and recursive search functionality
</commit_message>
<xml_diff>
--- a/IFT211/Smart Water Tank Lab Report (1).docx
+++ b/IFT211/Smart Water Tank Lab Report (1).docx
@@ -56,13 +56,18 @@
           <w:bCs w:val="1"/>
           <w:rtl w:val="0"/>
         </w:rPr>
-        <w:t xml:space="preserve">Institution:</w:t>
-      </w:r>
-      <w:r>
-        <w:rPr>
-          <w:rtl w:val="0"/>
-        </w:rPr>
-        <w:t xml:space="preserve"> MIVA Open University</w:t>
+        <w:t xml:space="preserve">Matric No: </w:t>
+      </w:r>
+      <w:r>
+        <w:rPr>
+          <w:rtl w:val="0"/>
+        </w:rPr>
+        <w:t xml:space="preserve">2025/A/SENG/0120</w:t>
+      </w:r>
+      <w:r>
+        <w:rPr>
+          <w:rtl w:val="0"/>
+        </w:rPr>
         <w:br w:type="textWrapping"/>
       </w:r>
       <w:r>
@@ -77,7 +82,7 @@
         <w:rPr>
           <w:rtl w:val="0"/>
         </w:rPr>
-        <w:t xml:space="preserve"> July 18, 2026</w:t>
+        <w:t xml:space="preserve"> July 17, 2026</w:t>
       </w:r>
     </w:p>
     <w:p>
@@ -1581,8 +1586,56 @@
         <w:pStyle w:val="Heading1"/>
         <w:rPr/>
       </w:pPr>
-      <w:bookmarkStart w:colFirst="0" w:colLast="0" w:name="_lv6ioiu7lvw" w:id="9"/>
+      <w:bookmarkStart w:colFirst="0" w:colLast="0" w:name="_za2hs7g8jban" w:id="9"/>
       <w:bookmarkEnd w:id="9"/>
+      <w:r>
+        <w:rPr/>
+        <w:drawing>
+          <wp:inline distB="114300" distT="114300" distL="114300" distR="114300">
+            <wp:extent cx="4057650" cy="4162425"/>
+            <wp:effectExtent b="0" l="0" r="0" t="0"/>
+            <wp:docPr id="1" name="image1.png"/>
+            <a:graphic>
+              <a:graphicData uri="http://schemas.openxmlformats.org/drawingml/2006/picture">
+                <pic:pic>
+                  <pic:nvPicPr>
+                    <pic:cNvPr id="0" name="image1.png"/>
+                    <pic:cNvPicPr preferRelativeResize="0"/>
+                  </pic:nvPicPr>
+                  <pic:blipFill>
+                    <a:blip r:embed="rId6"/>
+                    <a:srcRect b="0" l="0" r="0" t="0"/>
+                    <a:stretch>
+                      <a:fillRect/>
+                    </a:stretch>
+                  </pic:blipFill>
+                  <pic:spPr>
+                    <a:xfrm>
+                      <a:off x="0" y="0"/>
+                      <a:ext cx="4057650" cy="4162425"/>
+                    </a:xfrm>
+                    <a:prstGeom prst="rect"/>
+                    <a:ln/>
+                  </pic:spPr>
+                </pic:pic>
+              </a:graphicData>
+            </a:graphic>
+          </wp:inline>
+        </w:drawing>
+      </w:r>
+      <w:r>
+        <w:rPr>
+          <w:rtl w:val="0"/>
+        </w:rPr>
+      </w:r>
+    </w:p>
+    <w:p>
+      <w:pPr>
+        <w:pStyle w:val="Heading1"/>
+        <w:rPr/>
+      </w:pPr>
+      <w:bookmarkStart w:colFirst="0" w:colLast="0" w:name="_lv6ioiu7lvw" w:id="10"/>
+      <w:bookmarkEnd w:id="10"/>
       <w:r>
         <w:rPr>
           <w:rtl w:val="0"/>
@@ -1746,8 +1799,8 @@
         <w:pStyle w:val="Heading1"/>
         <w:rPr/>
       </w:pPr>
-      <w:bookmarkStart w:colFirst="0" w:colLast="0" w:name="_jjfpr5d7e3zp" w:id="10"/>
-      <w:bookmarkEnd w:id="10"/>
+      <w:bookmarkStart w:colFirst="0" w:colLast="0" w:name="_jjfpr5d7e3zp" w:id="11"/>
+      <w:bookmarkEnd w:id="11"/>
       <w:r>
         <w:rPr>
           <w:rtl w:val="0"/>
@@ -1800,6 +1853,88 @@
           <w:rtl w:val="0"/>
         </w:rPr>
         <w:t xml:space="preserve">From there, the 2 bit signal does a few different jobs. A comparator checks if the value is 11 and shuts the pump off if it is. A synchronous counter watches that same full signal and triggers an alarm if the tank stays full for three consecutive clock pulses. Finally, the binary level goes through a custom logic decoder to show the current water level as a number from 0 to 3 on the display.</w:t>
+      </w:r>
+    </w:p>
+    <w:p>
+      <w:pPr>
+        <w:rPr/>
+      </w:pPr>
+      <w:r>
+        <w:rPr/>
+        <w:drawing>
+          <wp:inline distB="114300" distT="114300" distL="114300" distR="114300">
+            <wp:extent cx="12753975" cy="6019800"/>
+            <wp:effectExtent b="0" l="0" r="0" t="0"/>
+            <wp:docPr id="2" name="image2.png"/>
+            <a:graphic>
+              <a:graphicData uri="http://schemas.openxmlformats.org/drawingml/2006/picture">
+                <pic:pic>
+                  <pic:nvPicPr>
+                    <pic:cNvPr id="0" name="image2.png"/>
+                    <pic:cNvPicPr preferRelativeResize="0"/>
+                  </pic:nvPicPr>
+                  <pic:blipFill>
+                    <a:blip r:embed="rId7"/>
+                    <a:srcRect b="0" l="0" r="0" t="0"/>
+                    <a:stretch>
+                      <a:fillRect/>
+                    </a:stretch>
+                  </pic:blipFill>
+                  <pic:spPr>
+                    <a:xfrm>
+                      <a:off x="0" y="0"/>
+                      <a:ext cx="12753975" cy="6019800"/>
+                    </a:xfrm>
+                    <a:prstGeom prst="rect"/>
+                    <a:ln/>
+                  </pic:spPr>
+                </pic:pic>
+              </a:graphicData>
+            </a:graphic>
+          </wp:inline>
+        </w:drawing>
+      </w:r>
+      <w:r>
+        <w:rPr>
+          <w:rtl w:val="0"/>
+        </w:rPr>
+      </w:r>
+    </w:p>
+    <w:p>
+      <w:pPr>
+        <w:rPr/>
+      </w:pPr>
+      <w:r>
+        <w:rPr>
+          <w:rtl w:val="0"/>
+        </w:rPr>
+      </w:r>
+    </w:p>
+    <w:p>
+      <w:pPr>
+        <w:rPr/>
+      </w:pPr>
+      <w:r>
+        <w:rPr>
+          <w:rtl w:val="0"/>
+        </w:rPr>
+        <w:t xml:space="preserve">The full design file for this circuit can be accessed at this </w:t>
+      </w:r>
+      <w:hyperlink r:id="rId8">
+        <w:r>
+          <w:rPr>
+            <w:color w:val="1155cc"/>
+            <w:u w:val="single"/>
+            <w:rtl w:val="0"/>
+          </w:rPr>
+          <w:t xml:space="preserve">Github repository</w:t>
+        </w:r>
+      </w:hyperlink>
+      <w:r>
+        <w:rPr>
+          <w:rtl w:val="0"/>
+        </w:rPr>
+        <w:t xml:space="preserve">.</w:t>
       </w:r>
     </w:p>
     <w:sectPr>

</xml_diff>